<commit_message>
VA GCP 36C24E26Q0054: complete bid package build
- Section 2 Technical + Section 3 Redacted Technical docx (full PWS 5.1-5.3
  task narrative, 7-business-day deliverables, PWS 7.3 quals mapping)
- Section 5 pricing workbook: Attachment 3 column O filled at $105/hr basis
  (blocks $840/$864/$888; PQS $105/$108/$111), $1,911,600 evaluated total
- Compliance matrix: added PWS 7.3.5/7.3.6 monitor-experience gate (10 yr
  monitoring / 5 yr federal / 3 refs per named monitor), 7-business-day
  report deadline, NACI
- Staffing/QA/Past Performance sections rebuilt: named monitors = qualified
  hires; Managing Director = program management only
- Pipeline board refreshed (M365 reconnect blocker, raised recruiting bar)

Co-Authored-By: Claude Fable 5 <noreply@anthropic.com>
Claude-Session: https://claude.ai/code/session_018QbYRYXyYvto9ftfSMLskQ
</commit_message>
<xml_diff>
--- a/capture/opportunities/2026-08-25_VA_36C24E26Q0054/03_proposal/docx/Section_2_Staffing_Plan.docx
+++ b/capture/opportunities/2026-08-25_VA_36C24E26Q0054/03_proposal/docx/Section_2_Staffing_Plan.docx
@@ -104,7 +104,7 @@
           <w:sz w:val="24"/>
           <w:szCs w:val="24"/>
         </w:rPr>
-        <w:t xml:space="preserve">Primary CRQA: [CANDIDATE NAME — CCRA-certified; contingent offer executed; certificates enclosed in Qualification Support Docs]. Performs monitoring visits from the first task order.</w:t>
+        <w:t xml:space="preserve">Named CRQA monitor(s): [MONITOR NAME(S) — senior CRQA(s), each meeting every PWS 7.3 element: 7.3.2 credential (degree/licensure/CCRA), documented GCP training (7.3.3), monitoring/HSP training or CCRA (7.3.4), 10+ years GCP clinical-trial monitoring of research sites (7.3.5), and 5+ years monitoring/auditing federally funded research (7.3.6) with the trial-by-trial listing at 7.3.6.1; contingent offer executed; full documentation enclosed in Qualification Support Docs]. Performs monitoring visits from the first task order.</w:t>
       </w:r>
     </w:p>
     <w:p>
@@ -122,7 +122,7 @@
           <w:sz w:val="24"/>
           <w:szCs w:val="24"/>
         </w:rPr>
-        <w:t xml:space="preserve">Second monitor and single point of accountability: Andrew O'Donnell, Managing Director — ACRP-certified with documented GCP, human subjects protection, and clinical monitoring training [course certificate enclosed], and extensive site-side GCP operations experience across multi-site federal (NIH) and industry protocols. Quality-reviews every deliverable before release and serves as escalation and scheduling POC.</w:t>
+        <w:t xml:space="preserve">Program management and single point of accountability: Andrew O'Donnell, Managing Director — ACRP-certified with documented GCP and human subjects protection training and extensive site-side GCP clinical research operations experience across multi-site federal (NIH) and industry protocols. Manages scheduling, credential currency, deliverable timeliness tracking, and escalation; administrative quality review (completeness, format, grammar, timeliness) of deliverables before release. Monitoring findings and reports are authored and owned by the named CRQA monitors.</w:t>
       </w:r>
     </w:p>
     <w:p>
@@ -140,7 +140,7 @@
           <w:sz w:val="24"/>
           <w:szCs w:val="24"/>
         </w:rPr>
-        <w:t xml:space="preserve">Credential-verified bench: an active national recruiting pipeline (public careers page and national job boards) with 70+ applicants to date, screened against PWS 7.3 as the application gate; additional monitors are engaged as task-order volume requires.</w:t>
+        <w:t xml:space="preserve">Credential-verified bench: an active national recruiting pipeline (public careers page and national job boards) with 70+ applicants to date, screened against the full PWS 7.3 qualification set as the application gate; additional qualified monitors are engaged as task-order volume requires.</w:t>
       </w:r>
     </w:p>
     <w:p>

</xml_diff>